<commit_message>
fix 2: added an item stats service
</commit_message>
<xml_diff>
--- a/CodeReview.docx
+++ b/CodeReview.docx
@@ -277,6 +277,151 @@
           <w14:ligatures w14:val="none"/>
         </w:rPr>
         <w:t>&gt;();</w:t>
+      </w:r>
+    </w:p>
+    <w:p>
+      <w:pPr>
+        <w:pStyle w:val="Heading2"/>
+        <w:rPr>
+          <w:lang w:val="en-US"/>
+        </w:rPr>
+      </w:pPr>
+      <w:r>
+        <w:rPr>
+          <w:lang w:val="en-US"/>
+        </w:rPr>
+        <w:t xml:space="preserve">Fix </w:t>
+      </w:r>
+      <w:r>
+        <w:rPr>
+          <w:lang w:val="en-US"/>
+        </w:rPr>
+        <w:t>2</w:t>
+      </w:r>
+      <w:r>
+        <w:rPr>
+          <w:lang w:val="en-US"/>
+        </w:rPr>
+        <w:t xml:space="preserve">: </w:t>
+      </w:r>
+      <w:r>
+        <w:t>Business logic in controller</w:t>
+      </w:r>
+      <w:r>
+        <w:t xml:space="preserve"> </w:t>
+      </w:r>
+      <w:r>
+        <w:rPr>
+          <w:lang w:val="en-US"/>
+        </w:rPr>
+        <w:t xml:space="preserve">| </w:t>
+      </w:r>
+      <w:r>
+        <w:rPr>
+          <w:lang w:val="en-US"/>
+        </w:rPr>
+        <w:t>SRP</w:t>
+      </w:r>
+    </w:p>
+    <w:p>
+      <w:pPr>
+        <w:rPr>
+          <w:lang w:val="en-US"/>
+        </w:rPr>
+      </w:pPr>
+      <w:r>
+        <w:rPr>
+          <w:lang w:val="en-US"/>
+        </w:rPr>
+        <w:t xml:space="preserve">Where: </w:t>
+      </w:r>
+      <w:proofErr w:type="spellStart"/>
+      <w:r>
+        <w:rPr>
+          <w:lang w:val="en-US"/>
+        </w:rPr>
+        <w:t>ItemController</w:t>
+      </w:r>
+      <w:r>
+        <w:rPr>
+          <w:lang w:val="en-US"/>
+        </w:rPr>
+        <w:t>.cs</w:t>
+      </w:r>
+      <w:proofErr w:type="spellEnd"/>
+      <w:r>
+        <w:rPr>
+          <w:lang w:val="en-US"/>
+        </w:rPr>
+        <w:t xml:space="preserve">: </w:t>
+      </w:r>
+      <w:proofErr w:type="spellStart"/>
+      <w:r>
+        <w:rPr>
+          <w:lang w:val="en-US"/>
+        </w:rPr>
+        <w:t>GetAll</w:t>
+      </w:r>
+      <w:proofErr w:type="spellEnd"/>
+      <w:r>
+        <w:rPr>
+          <w:lang w:val="en-US"/>
+        </w:rPr>
+        <w:t xml:space="preserve"> method</w:t>
+      </w:r>
+    </w:p>
+    <w:p>
+      <w:r>
+        <w:rPr>
+          <w:lang w:val="en-US"/>
+        </w:rPr>
+        <w:t xml:space="preserve">Why: </w:t>
+      </w:r>
+      <w:r>
+        <w:rPr>
+          <w:lang w:val="en-US"/>
+        </w:rPr>
+        <w:t xml:space="preserve">The </w:t>
+      </w:r>
+      <w:r>
+        <w:rPr>
+          <w:lang w:val="en-US"/>
+        </w:rPr>
+        <w:t>controller’s</w:t>
+      </w:r>
+      <w:r>
+        <w:rPr>
+          <w:lang w:val="en-US"/>
+        </w:rPr>
+        <w:t xml:space="preserve"> responsibility </w:t>
+      </w:r>
+      <w:r>
+        <w:t>is to handle HTTP requests and responses, not to execute business logic like calculating item statistics, breaking the Single Responsibility Principle</w:t>
+      </w:r>
+      <w:r>
+        <w:t>.</w:t>
+      </w:r>
+    </w:p>
+    <w:p>
+      <w:pPr>
+        <w:rPr>
+          <w:lang w:val="en-US"/>
+        </w:rPr>
+      </w:pPr>
+      <w:r>
+        <w:rPr>
+          <w:lang w:val="en-US"/>
+        </w:rPr>
+        <w:t xml:space="preserve">Fix: </w:t>
+      </w:r>
+      <w:r>
+        <w:t xml:space="preserve">Created the IItemStats interface and ItemStatsService implementation to handle the </w:t>
+      </w:r>
+      <w:r>
+        <w:t>calculations and</w:t>
+      </w:r>
+      <w:r>
+        <w:t xml:space="preserve"> injected this dependency into the controller.</w:t>
       </w:r>
     </w:p>
     <w:p>

</xml_diff>

<commit_message>
fix 3: hardcoded logging
</commit_message>
<xml_diff>
--- a/CodeReview.docx
+++ b/CodeReview.docx
@@ -422,6 +422,150 @@
       </w:r>
       <w:r>
         <w:t xml:space="preserve"> injected this dependency into the controller.</w:t>
+      </w:r>
+    </w:p>
+    <w:p>
+      <w:pPr>
+        <w:pStyle w:val="Heading2"/>
+        <w:rPr>
+          <w:lang w:val="en-US"/>
+        </w:rPr>
+      </w:pPr>
+      <w:r>
+        <w:rPr>
+          <w:lang w:val="en-US"/>
+        </w:rPr>
+        <w:t xml:space="preserve">Fix </w:t>
+      </w:r>
+      <w:r>
+        <w:rPr>
+          <w:lang w:val="en-US"/>
+        </w:rPr>
+        <w:t>3</w:t>
+      </w:r>
+      <w:r>
+        <w:rPr>
+          <w:lang w:val="en-US"/>
+        </w:rPr>
+        <w:t xml:space="preserve">: </w:t>
+      </w:r>
+      <w:r>
+        <w:t>Hardcoded console logging</w:t>
+      </w:r>
+      <w:r>
+        <w:t xml:space="preserve"> </w:t>
+      </w:r>
+      <w:r>
+        <w:rPr>
+          <w:lang w:val="en-US"/>
+        </w:rPr>
+        <w:t xml:space="preserve">| </w:t>
+      </w:r>
+      <w:r>
+        <w:rPr>
+          <w:lang w:val="en-US"/>
+        </w:rPr>
+        <w:t>DIP</w:t>
+      </w:r>
+    </w:p>
+    <w:p>
+      <w:pPr>
+        <w:rPr>
+          <w:lang w:val="en-US"/>
+        </w:rPr>
+      </w:pPr>
+      <w:r>
+        <w:rPr>
+          <w:lang w:val="en-US"/>
+        </w:rPr>
+        <w:t xml:space="preserve">Where: </w:t>
+      </w:r>
+      <w:proofErr w:type="spellStart"/>
+      <w:r>
+        <w:rPr>
+          <w:lang w:val="en-US"/>
+        </w:rPr>
+        <w:t>ItemController.cs</w:t>
+      </w:r>
+      <w:proofErr w:type="spellEnd"/>
+      <w:r>
+        <w:rPr>
+          <w:lang w:val="en-US"/>
+        </w:rPr>
+        <w:t xml:space="preserve">: </w:t>
+      </w:r>
+      <w:proofErr w:type="spellStart"/>
+      <w:r>
+        <w:rPr>
+          <w:lang w:val="en-US"/>
+        </w:rPr>
+        <w:t>GetAll</w:t>
+      </w:r>
+      <w:proofErr w:type="spellEnd"/>
+      <w:r>
+        <w:rPr>
+          <w:lang w:val="en-US"/>
+        </w:rPr>
+        <w:t xml:space="preserve"> </w:t>
+      </w:r>
+      <w:r>
+        <w:rPr>
+          <w:lang w:val="en-US"/>
+        </w:rPr>
+        <w:t xml:space="preserve">and </w:t>
+      </w:r>
+      <w:proofErr w:type="spellStart"/>
+      <w:r>
+        <w:rPr>
+          <w:lang w:val="en-US"/>
+        </w:rPr>
+        <w:t>GetById</w:t>
+      </w:r>
+      <w:proofErr w:type="spellEnd"/>
+      <w:r>
+        <w:rPr>
+          <w:lang w:val="en-US"/>
+        </w:rPr>
+        <w:t xml:space="preserve"> </w:t>
+      </w:r>
+      <w:r>
+        <w:rPr>
+          <w:lang w:val="en-US"/>
+        </w:rPr>
+        <w:t>method</w:t>
+      </w:r>
+      <w:r>
+        <w:rPr>
+          <w:lang w:val="en-US"/>
+        </w:rPr>
+        <w:t>s</w:t>
+      </w:r>
+    </w:p>
+    <w:p>
+      <w:r>
+        <w:rPr>
+          <w:lang w:val="en-US"/>
+        </w:rPr>
+        <w:t xml:space="preserve">Why: </w:t>
+      </w:r>
+      <w:r>
+        <w:t>The controller depends directly on the Console class to write logs. This tightly couples the controller to specific terminal logging rather than an abstraction that enables the possibility to log to a file or database, breaking the Dependency Inversion Principle.</w:t>
+      </w:r>
+    </w:p>
+    <w:p>
+      <w:pPr>
+        <w:rPr>
+          <w:lang w:val="en-US"/>
+        </w:rPr>
+      </w:pPr>
+      <w:r>
+        <w:rPr>
+          <w:lang w:val="en-US"/>
+        </w:rPr>
+        <w:t xml:space="preserve">Fix: </w:t>
+      </w:r>
+      <w:r>
+        <w:t>Injected the built-in ILogger&lt;ItemController&gt; interface via the constructor and replaced all Console.WriteLine() calls with appropriate _logger.LogInformation() and _logger.LogWarning() methods.</w:t>
       </w:r>
     </w:p>
     <w:p>

</xml_diff>

<commit_message>
fix 4: renaming Item to Grade
</commit_message>
<xml_diff>
--- a/CodeReview.docx
+++ b/CodeReview.docx
@@ -553,11 +553,6 @@
       </w:r>
     </w:p>
     <w:p>
-      <w:pPr>
-        <w:rPr>
-          <w:lang w:val="en-US"/>
-        </w:rPr>
-      </w:pPr>
       <w:r>
         <w:rPr>
           <w:lang w:val="en-US"/>
@@ -565,15 +560,79 @@
         <w:t xml:space="preserve">Fix: </w:t>
       </w:r>
       <w:r>
-        <w:t>Injected the built-in ILogger&lt;ItemController&gt; interface via the constructor and replaced all Console.WriteLine() calls with appropriate _logger.LogInformation() and _logger.LogWarning() methods.</w:t>
+        <w:t>Injected the built-in ILogger&lt;ItemController&gt; interface via the constructor and replaced all Console.WriteLine(</w:t>
+      </w:r>
+      <w:r>
+        <w:t>)</w:t>
+      </w:r>
+      <w:r>
+        <w:t xml:space="preserve"> calls with appropriate _logger.LogInformation() and _logger.LogWarning() methods.</w:t>
       </w:r>
     </w:p>
     <w:p>
       <w:pPr>
+        <w:pStyle w:val="Heading2"/>
         <w:rPr>
           <w:lang w:val="en-US"/>
         </w:rPr>
       </w:pPr>
+      <w:r>
+        <w:rPr>
+          <w:lang w:val="en-US"/>
+        </w:rPr>
+        <w:t xml:space="preserve">Fix </w:t>
+      </w:r>
+      <w:r>
+        <w:rPr>
+          <w:lang w:val="en-US"/>
+        </w:rPr>
+        <w:t>4</w:t>
+      </w:r>
+      <w:r>
+        <w:rPr>
+          <w:lang w:val="en-US"/>
+        </w:rPr>
+        <w:t xml:space="preserve">: </w:t>
+      </w:r>
+      <w:r>
+        <w:t xml:space="preserve">Generic </w:t>
+      </w:r>
+      <w:r>
+        <w:t xml:space="preserve">naming </w:t>
+      </w:r>
+      <w:r>
+        <w:rPr>
+          <w:lang w:val="en-US"/>
+        </w:rPr>
+        <w:t xml:space="preserve">| </w:t>
+      </w:r>
+      <w:r>
+        <w:rPr>
+          <w:lang w:val="en-US"/>
+        </w:rPr>
+        <w:t>Additional</w:t>
+      </w:r>
+    </w:p>
+    <w:p>
+      <w:r>
+        <w:t xml:space="preserve">Why: </w:t>
+      </w:r>
+      <w:r>
+        <w:t>The generic model name Item does not reflect its actual usage in a Grade Book context. Using non-descriptive names makes the codebase confusing, harder to maintain, and violates the principles of Domain-Driven Design.</w:t>
+      </w:r>
+    </w:p>
+    <w:p>
+      <w:pPr>
+        <w:rPr>
+          <w:lang w:val="en-US"/>
+        </w:rPr>
+      </w:pPr>
+      <w:r>
+        <w:t xml:space="preserve">Fix: </w:t>
+      </w:r>
+      <w:r>
+        <w:t>Changed Item to Grade throughout the project, including class names, variable names, interfaces, and API routes.</w:t>
+      </w:r>
     </w:p>
     <w:sectPr>
       <w:pgSz w:w="11906" w:h="16838"/>

</xml_diff>

<commit_message>
fix 5: added GradeService
</commit_message>
<xml_diff>
--- a/CodeReview.docx
+++ b/CodeReview.docx
@@ -566,7 +566,23 @@
         <w:t>)</w:t>
       </w:r>
       <w:r>
-        <w:t xml:space="preserve"> calls with appropriate _logger.LogInformation() and _logger.LogWarning() methods.</w:t>
+        <w:t xml:space="preserve"> calls with appropriate _</w:t>
+      </w:r>
+      <w:proofErr w:type="gramStart"/>
+      <w:r>
+        <w:t>logger.LogInformation</w:t>
+      </w:r>
+      <w:proofErr w:type="gramEnd"/>
+      <w:r>
+        <w:t>() and _</w:t>
+      </w:r>
+      <w:proofErr w:type="gramStart"/>
+      <w:r>
+        <w:t>logger.LogWarning</w:t>
+      </w:r>
+      <w:proofErr w:type="gramEnd"/>
+      <w:r>
+        <w:t>() methods.</w:t>
       </w:r>
     </w:p>
     <w:p>
@@ -622,17 +638,147 @@
       </w:r>
     </w:p>
     <w:p>
+      <w:r>
+        <w:t xml:space="preserve">Fix: </w:t>
+      </w:r>
+      <w:r>
+        <w:t>Changed Item to Grade throughout the project, including class names, variable names, interfaces and API routes.</w:t>
+      </w:r>
+    </w:p>
+    <w:p>
       <w:pPr>
+        <w:pStyle w:val="Heading2"/>
         <w:rPr>
           <w:lang w:val="en-US"/>
         </w:rPr>
       </w:pPr>
       <w:r>
+        <w:rPr>
+          <w:lang w:val="en-US"/>
+        </w:rPr>
+        <w:lastRenderedPageBreak/>
+        <w:t xml:space="preserve">Fix </w:t>
+      </w:r>
+      <w:r>
+        <w:rPr>
+          <w:lang w:val="en-US"/>
+        </w:rPr>
+        <w:t>5</w:t>
+      </w:r>
+      <w:r>
+        <w:rPr>
+          <w:lang w:val="en-US"/>
+        </w:rPr>
+        <w:t xml:space="preserve">: </w:t>
+      </w:r>
+      <w:r>
+        <w:t>Controller has too much responsibility</w:t>
+      </w:r>
+      <w:r>
+        <w:t xml:space="preserve"> </w:t>
+      </w:r>
+      <w:r>
+        <w:rPr>
+          <w:lang w:val="en-US"/>
+        </w:rPr>
+        <w:t xml:space="preserve">| </w:t>
+      </w:r>
+      <w:r>
+        <w:rPr>
+          <w:lang w:val="en-US"/>
+        </w:rPr>
+        <w:t>SRP</w:t>
+      </w:r>
+    </w:p>
+    <w:p>
+      <w:pPr>
+        <w:rPr>
+          <w:lang w:val="en-US"/>
+        </w:rPr>
+      </w:pPr>
+      <w:r>
+        <w:rPr>
+          <w:lang w:val="en-US"/>
+        </w:rPr>
+        <w:t xml:space="preserve">Where: </w:t>
+      </w:r>
+      <w:proofErr w:type="spellStart"/>
+      <w:r>
+        <w:rPr>
+          <w:lang w:val="en-US"/>
+        </w:rPr>
+        <w:t>ItemController.cs</w:t>
+      </w:r>
+      <w:proofErr w:type="spellEnd"/>
+      <w:r>
+        <w:rPr>
+          <w:lang w:val="en-US"/>
+        </w:rPr>
+        <w:t xml:space="preserve">: </w:t>
+      </w:r>
+      <w:proofErr w:type="spellStart"/>
+      <w:r>
+        <w:rPr>
+          <w:lang w:val="en-US"/>
+        </w:rPr>
+        <w:t>GetAll</w:t>
+      </w:r>
+      <w:proofErr w:type="spellEnd"/>
+      <w:r>
+        <w:rPr>
+          <w:lang w:val="en-US"/>
+        </w:rPr>
+        <w:t xml:space="preserve"> and </w:t>
+      </w:r>
+      <w:proofErr w:type="spellStart"/>
+      <w:r>
+        <w:rPr>
+          <w:lang w:val="en-US"/>
+        </w:rPr>
+        <w:t>GetById</w:t>
+      </w:r>
+      <w:proofErr w:type="spellEnd"/>
+      <w:r>
+        <w:rPr>
+          <w:lang w:val="en-US"/>
+        </w:rPr>
+        <w:t xml:space="preserve"> methods</w:t>
+      </w:r>
+    </w:p>
+    <w:p>
+      <w:r>
+        <w:rPr>
+          <w:lang w:val="en-US"/>
+        </w:rPr>
+        <w:t xml:space="preserve">Why: </w:t>
+      </w:r>
+      <w:r>
+        <w:t>The controller was doing too much, like fetching raw data from the repository and handling business logic. Its main job should be strictly handling HTTP requests, status codes, and input validation.</w:t>
+      </w:r>
+    </w:p>
+    <w:p>
+      <w:r>
+        <w:rPr>
+          <w:lang w:val="en-US"/>
+        </w:rPr>
         <w:t xml:space="preserve">Fix: </w:t>
       </w:r>
       <w:r>
-        <w:t>Changed Item to Grade throughout the project, including class names, variable names, interfaces, and API routes.</w:t>
-      </w:r>
+        <w:t xml:space="preserve">Created the IGradeService interface and GradeService implementation to handle the </w:t>
+      </w:r>
+      <w:r>
+        <w:t xml:space="preserve">remaining </w:t>
+      </w:r>
+      <w:r>
+        <w:t>business logic and data mapping, then injected this service into the controller.</w:t>
+      </w:r>
+    </w:p>
+    <w:p>
+      <w:pPr>
+        <w:rPr>
+          <w:lang w:val="en-US"/>
+        </w:rPr>
+      </w:pPr>
     </w:p>
     <w:sectPr>
       <w:pgSz w:w="11906" w:h="16838"/>
@@ -1044,6 +1190,7 @@
   <w:style w:type="paragraph" w:default="1" w:styleId="Normal">
     <w:name w:val="Normal"/>
     <w:qFormat/>
+    <w:rsid w:val="00656D98"/>
   </w:style>
   <w:style w:type="paragraph" w:styleId="Heading1">
     <w:name w:val="heading 1"/>

</xml_diff>

<commit_message>
fix 6: closed GradeRepository
</commit_message>
<xml_diff>
--- a/CodeReview.docx
+++ b/CodeReview.docx
@@ -566,23 +566,7 @@
         <w:t>)</w:t>
       </w:r>
       <w:r>
-        <w:t xml:space="preserve"> calls with appropriate _</w:t>
-      </w:r>
-      <w:proofErr w:type="gramStart"/>
-      <w:r>
-        <w:t>logger.LogInformation</w:t>
-      </w:r>
-      <w:proofErr w:type="gramEnd"/>
-      <w:r>
-        <w:t>() and _</w:t>
-      </w:r>
-      <w:proofErr w:type="gramStart"/>
-      <w:r>
-        <w:t>logger.LogWarning</w:t>
-      </w:r>
-      <w:proofErr w:type="gramEnd"/>
-      <w:r>
-        <w:t>() methods.</w:t>
+        <w:t xml:space="preserve"> calls with appropriate _logger.LogInformation() and _logger.LogWarning() methods.</w:t>
       </w:r>
     </w:p>
     <w:p>
@@ -707,7 +691,13 @@
         <w:rPr>
           <w:lang w:val="en-US"/>
         </w:rPr>
-        <w:t>ItemController.cs</w:t>
+        <w:t>Grade</w:t>
+      </w:r>
+      <w:r>
+        <w:rPr>
+          <w:lang w:val="en-US"/>
+        </w:rPr>
+        <w:t>Controller.cs</w:t>
       </w:r>
       <w:proofErr w:type="spellEnd"/>
       <w:r>
@@ -773,12 +763,104 @@
         <w:t>business logic and data mapping, then injected this service into the controller.</w:t>
       </w:r>
     </w:p>
+    <w:p/>
     <w:p>
       <w:pPr>
+        <w:pStyle w:val="Heading2"/>
         <w:rPr>
           <w:lang w:val="en-US"/>
         </w:rPr>
       </w:pPr>
+      <w:r>
+        <w:rPr>
+          <w:lang w:val="en-US"/>
+        </w:rPr>
+        <w:t xml:space="preserve">Fix </w:t>
+      </w:r>
+      <w:r>
+        <w:rPr>
+          <w:lang w:val="en-US"/>
+        </w:rPr>
+        <w:t>6</w:t>
+      </w:r>
+      <w:r>
+        <w:rPr>
+          <w:lang w:val="en-US"/>
+        </w:rPr>
+        <w:t xml:space="preserve">: </w:t>
+      </w:r>
+      <w:r>
+        <w:t>Unnecessary inheritance surface</w:t>
+      </w:r>
+      <w:r>
+        <w:t xml:space="preserve"> </w:t>
+      </w:r>
+      <w:r>
+        <w:rPr>
+          <w:lang w:val="en-US"/>
+        </w:rPr>
+        <w:t xml:space="preserve">| </w:t>
+      </w:r>
+      <w:r>
+        <w:rPr>
+          <w:lang w:val="en-US"/>
+        </w:rPr>
+        <w:t>OCP</w:t>
+      </w:r>
+    </w:p>
+    <w:p>
+      <w:pPr>
+        <w:rPr>
+          <w:lang w:val="en-US"/>
+        </w:rPr>
+      </w:pPr>
+      <w:r>
+        <w:rPr>
+          <w:lang w:val="en-US"/>
+        </w:rPr>
+        <w:t xml:space="preserve">Where: </w:t>
+      </w:r>
+      <w:proofErr w:type="spellStart"/>
+      <w:r>
+        <w:rPr>
+          <w:lang w:val="en-US"/>
+        </w:rPr>
+        <w:t>GradeRepository.cs</w:t>
+      </w:r>
+      <w:proofErr w:type="spellEnd"/>
+    </w:p>
+    <w:p>
+      <w:r>
+        <w:rPr>
+          <w:lang w:val="en-US"/>
+        </w:rPr>
+        <w:t xml:space="preserve">Why: </w:t>
+      </w:r>
+      <w:r>
+        <w:rPr>
+          <w:lang w:val="en-US"/>
+        </w:rPr>
+        <w:t>T</w:t>
+      </w:r>
+      <w:r>
+        <w:t>he repository used virtual methods and protected members, inviting inheritance that was not required for its current scope. It also contained an unused field (_nextId) which was redundant.</w:t>
+      </w:r>
+    </w:p>
+    <w:p>
+      <w:pPr>
+        <w:rPr>
+          <w:lang w:val="en-US"/>
+        </w:rPr>
+      </w:pPr>
+      <w:r>
+        <w:rPr>
+          <w:lang w:val="en-US"/>
+        </w:rPr>
+        <w:t xml:space="preserve">Fix: </w:t>
+      </w:r>
+      <w:r>
+        <w:t>Sealed the class to prevent unintended inheritance, removed the virtual modifiers, and deleted the unused field to clean up the implementation.</w:t>
+      </w:r>
     </w:p>
     <w:sectPr>
       <w:pgSz w:w="11906" w:h="16838"/>

</xml_diff>